<commit_message>
Unit Test run: all 269 cases filled in, and the plan wording matched to the screens
The first run failed 9 cases on plan wording (the system was right): Notifications
opens from the bell, browser tooltips come first, the blind end-of-day count, etc.
The System plan, UAT, demo scripts and test scripts got the same corrections.

Co-Authored-By: Claude Opus 5.5 <noreply@anthropic.com>
</commit_message>
<xml_diff>
--- a/QA/FETCH-Demo-Script-for-the-Owner.docx
+++ b/QA/FETCH-Demo-Script-for-the-Owner.docx
@@ -4300,7 +4300,7 @@
                 <w:sz w:val="19"/>
                 <w:szCs w:val="19"/>
               </w:rPr>
-              <w:t xml:space="preserve">Click End of day and show the expected cash (save the count only after closing).</w:t>
+              <w:t>Click End of day and show the window (save the count only after closing; the expected cash appears once it is saved).</w:t>
             </w:r>
           </w:p>
         </w:tc>
@@ -4373,7 +4373,7 @@
                 <w:sz w:val="20"/>
                 <w:szCs w:val="20"/>
               </w:rPr>
-              <w:t xml:space="preserve">"At closing, your staff counts the drawer. FETCH already knows how much should be there, the starting cash plus cash sales, plus or minus any cash put in or taken out, and shows right away if it is balanced, over or short."</w:t>
+              <w:t>"At closing, your staff counts the drawer without seeing how much FETCH expects, so they type what is really there. Once the count is saved, FETCH shows how much should be there, the starting cash plus cash sales, plus or minus any cash put in or taken out, and whether it is balanced, over or short."</w:t>
             </w:r>
           </w:p>
         </w:tc>

</xml_diff>